<commit_message>
Translate the adversarial audit report into Chinese
Co-Authored-By: Claude Opus 5.5 <noreply@anthropic.com>
Claude-Session: https://claude.ai/code/session_01W8vS2pr8wPj5JjARMAH2UK
</commit_message>
<xml_diff>
--- a/2027青C申请书_长三角/2027青C_对抗式审查报告.docx
+++ b/2027青C申请书_长三角/2027青C_对抗式审查报告.docx
@@ -225,7 +225,7 @@
                 <w:b w:val="0"/>
                 <w:sz w:val="21"/>
               </w:rPr>
-              <w:t>(1) Template outline headings and bracke…</w:t>
+              <w:t>(1) 模板提纲标题及括…</w:t>
             </w:r>
           </w:p>
         </w:tc>
@@ -265,7 +265,7 @@
                 <w:b w:val="0"/>
                 <w:sz w:val="21"/>
               </w:rPr>
-              <w:t>I ran build_yrd.sh (pages=30, last_page_lines=13, 47 refs, 2 figures, 2 tables), stripped …</w:t>
+              <w:t>运行build_yrd.sh（pages=30，last_page_lines=13，参考文献47条，图2幅，表2张），去除…</w:t>
             </w:r>
           </w:p>
         </w:tc>
@@ -287,7 +287,7 @@
                 <w:b w:val="0"/>
                 <w:sz w:val="21"/>
               </w:rPr>
-              <w:t>(2) Page count ≤30 and every page used e…</w:t>
+              <w:t>(2) 页数≤30且每页均充分利…</w:t>
             </w:r>
           </w:p>
         </w:tc>
@@ -327,7 +327,7 @@
                 <w:b w:val="0"/>
                 <w:sz w:val="21"/>
               </w:rPr>
-              <w:t>pages=30, per_page=[24,22,22,22,22,22,40,45,34,23,22,11,19,8,24,23,22,22,21,24,29,29,23,23…</w:t>
+              <w:t>pages=30，per_page=[24,22,22,22,22,22,40,45,34,23,22,11,19,8,24,23,22,22,21,24,29,29,23,23…</w:t>
             </w:r>
           </w:p>
         </w:tc>
@@ -349,7 +349,7 @@
                 <w:b w:val="0"/>
                 <w:sz w:val="21"/>
               </w:rPr>
-              <w:t>(3) （一） answers why/value with literatur…</w:t>
+              <w:t>(3) （一）回答研究缘由／价值并结合文…</w:t>
             </w:r>
           </w:p>
         </w:tc>
@@ -389,7 +389,7 @@
                 <w:b w:val="0"/>
                 <w:sz w:val="21"/>
               </w:rPr>
-              <w:t>s1 covers background (1), domestic and international review with three explicit gaps (2.1–…</w:t>
+              <w:t>s1涵盖研究背景（1）、国内外研究现状综述及三项明确的研究缺口（2.1–…</w:t>
             </w:r>
           </w:p>
         </w:tc>
@@ -411,7 +411,7 @@
                 <w:b w:val="0"/>
                 <w:sz w:val="21"/>
               </w:rPr>
-              <w:t>(4) （二） contains 研究目标/内容/关键科学问题/方案 + 特色与…</w:t>
+              <w:t>(4) （二）包含研究目标/内容/关键科学问题/方案及特色与…</w:t>
             </w:r>
           </w:p>
         </w:tc>
@@ -451,7 +451,7 @@
                 <w:b w:val="0"/>
                 <w:sz w:val="21"/>
               </w:rPr>
-              <w:t>s2a 1.1 核心/关键科学问题1–3 with H1a–H3b; 1.2 研究目标 (总体 + 3 具体); s2b 3. 研究内容与研究方案 (3.1–3.5 with 检验…</w:t>
+              <w:t>s2a 1.1 核心/关键科学问题1–3及H1a–H3b；1.2 研究目标（总体目标与3项具体目标）；s2b 3. 研究内容与研究方案（3.1–3.5，含检验…</w:t>
             </w:r>
           </w:p>
         </w:tc>
@@ -473,7 +473,7 @@
                 <w:b w:val="0"/>
                 <w:sz w:val="21"/>
               </w:rPr>
-              <w:t>(5) （三）1 积累/成绩/风险应对; （三）2 已具备/尚缺少及途径/国家实…</w:t>
+              <w:t>(5) （三）1 积累/成绩/风险应对；（三）2 已具备/尚缺少及途径/国家实…</w:t>
             </w:r>
           </w:p>
         </w:tc>
@@ -513,7 +513,7 @@
                 <w:b w:val="0"/>
                 <w:sz w:val="21"/>
               </w:rPr>
-              <w:t>（三）1 has （1）前期研究积累, （2）已取得的研究工作成绩, （3）可行性分析 and （4）研究风险的应对措施 (7 risks tied to milestones):…</w:t>
+              <w:t>（三）1包含（1）前期研究积累、（2）已取得的研究工作成绩、（3）可行性分析和（4）研究风险的应对措施（7项风险，均与考核节点挂钩）：…</w:t>
             </w:r>
           </w:p>
         </w:tc>
@@ -535,7 +535,7 @@
                 <w:b w:val="0"/>
                 <w:sz w:val="21"/>
               </w:rPr>
-              <w:t>(6) （四）1–5 answered appropriately for a …</w:t>
+              <w:t>(6) （四）1–5的作答是否适合于…</w:t>
             </w:r>
           </w:p>
         </w:tc>
@@ -575,7 +575,7 @@
                 <w:b w:val="0"/>
                 <w:sz w:val="21"/>
               </w:rPr>
-              <w:t>4-1 '无。</w:t>
+              <w:t>4-1“无。</w:t>
             </w:r>
             <w:r>
               <w:rPr>
@@ -592,7 +592,7 @@
                 <w:b w:val="0"/>
                 <w:sz w:val="21"/>
               </w:rPr>
-              <w:t>', 4-2/4-3 '不适用（无高级职称）。' and 4-4 '无。' are appropriate. 4-5 holds the JRFS rela…</w:t>
+              <w:t>”、4-2/4-3“不适用（无高级职称）。”及4-4“无。”均恰当。4-5说明了与JRFS的关…</w:t>
             </w:r>
           </w:p>
         </w:tc>
@@ -614,7 +614,7 @@
                 <w:b w:val="0"/>
                 <w:sz w:val="21"/>
               </w:rPr>
-              <w:t>(7) NSFC rules: AI disclosure, other-cha…</w:t>
+              <w:t>(7) NSFC规定：AI使用声明、其他渠…</w:t>
             </w:r>
           </w:p>
         </w:tc>
@@ -654,7 +654,7 @@
                 <w:b w:val="0"/>
                 <w:sz w:val="21"/>
               </w:rPr>
-              <w:t>Passes: no budget figure for this project (other projects' amounts appear only where the t…</w:t>
+              <w:t>通过项：未出现本项目经费数额（其他项目的金额仅出现在…</w:t>
             </w:r>
           </w:p>
         </w:tc>
@@ -676,7 +676,7 @@
                 <w:b w:val="0"/>
                 <w:sz w:val="21"/>
               </w:rPr>
-              <w:t>(8) References: GB/T 7714-2015 consisten…</w:t>
+              <w:t>(8) 参考文献：GB/T 7714-2015一致…</w:t>
             </w:r>
           </w:p>
         </w:tc>
@@ -716,7 +716,7 @@
                 <w:b w:val="0"/>
                 <w:sz w:val="21"/>
               </w:rPr>
-              <w:t>All 47 cited keys are in brief §8/§8b and refs_yrd.json, and the numbering follows first c…</w:t>
+              <w:t>所引47个文献键均见于写作简报§8/§8b及refs_yrd.json，编号按首次引…</w:t>
             </w:r>
           </w:p>
         </w:tc>
@@ -738,7 +738,7 @@
                 <w:b w:val="0"/>
                 <w:sz w:val="21"/>
               </w:rPr>
-              <w:t>(9) Figures/tables numbered, captioned c…</w:t>
+              <w:t>(9) 图表编号、题注规…</w:t>
             </w:r>
           </w:p>
         </w:tc>
@@ -778,7 +778,7 @@
                 <w:b w:val="0"/>
                 <w:sz w:val="21"/>
               </w:rPr>
-              <w:t>图1 研究框架 and 图2 技术路线 have captions below the figure; 表1 主要数据与获取状态 and 表2 年度研究计划与考核节点 have c…</w:t>
+              <w:t>图1 研究框架与图2 技术路线的图题均位于图下方；表1 主要数据与获取状态和表2 年度研究计划与考核节点的表…</w:t>
             </w:r>
           </w:p>
         </w:tc>
@@ -800,7 +800,7 @@
                 <w:b w:val="0"/>
                 <w:sz w:val="21"/>
               </w:rPr>
-              <w:t>(10) Abbreviations defined at first use;…</w:t>
+              <w:t>(10) 缩写首次出现时给出定义；…</w:t>
             </w:r>
           </w:p>
         </w:tc>
@@ -840,7 +840,7 @@
                 <w:b w:val="0"/>
                 <w:sz w:val="21"/>
               </w:rPr>
-              <w:t>The core terms are defined properly (NbS, LST, Ta, Tmrt, UTCI, UGCoP, DLNM, DCP, YRD-HES, …</w:t>
+              <w:t>核心术语定义规范（NbS、LST、Ta、Tmrt、UTCI、UGCoP、DLNM、DCP、YRD-HES、…</w:t>
             </w:r>
           </w:p>
         </w:tc>
@@ -1981,7 +1981,7 @@
                 <w:b w:val="0"/>
                 <w:sz w:val="21"/>
               </w:rPr>
-              <w:t>Factual statements vs brief §7 (only con…</w:t>
+              <w:t>事实陈述与写作简报§7比对（仅限已确…</w:t>
             </w:r>
           </w:p>
         </w:tc>
@@ -2021,7 +2021,7 @@
                 <w:b w:val="0"/>
                 <w:sz w:val="21"/>
               </w:rPr>
-              <w:t>Every number in s1 matches a confirmed or corrected §7 entry. Checked: 0.31 °C per decade;…</w:t>
+              <w:t>s1中的全部数字均与§7中已确认或已更正的条目一致。核查项：每10年0.31 °C；…</w:t>
             </w:r>
           </w:p>
         </w:tc>
@@ -2043,7 +2043,7 @@
                 <w:b w:val="0"/>
                 <w:sz w:val="21"/>
               </w:rPr>
-              <w:t xml:space="preserve">Each </w:t>
+              <w:t>每个</w:t>
             </w:r>
             <w:r>
               <w:rPr>
@@ -2051,7 +2051,7 @@
                 <w:b w:val="0"/>
                 <w:sz w:val="21"/>
               </w:rPr>
-              <w:t xml:space="preserve"> actually supports the senten…</w:t>
+              <w:t>是否确实支撑所在句…</w:t>
             </w:r>
           </w:p>
         </w:tc>
@@ -2091,7 +2091,7 @@
                 <w:b w:val="0"/>
                 <w:sz w:val="21"/>
               </w:rPr>
-              <w:t>Most citations are precise: hu2025heatwave2022, chen2018bmj272, yang2021ncomms, song2021 (…</w:t>
+              <w:t>多数引用准确：hu2025heatwave2022、chen2018bmj272、yang2021ncomms、song2021（…</w:t>
             </w:r>
           </w:p>
         </w:tc>
@@ -2113,7 +2113,7 @@
                 <w:b w:val="0"/>
                 <w:sz w:val="21"/>
               </w:rPr>
-              <w:t>已获得 data claims match spec §1</w:t>
+              <w:t>“已获得”数据表述与改写规格§1一致</w:t>
             </w:r>
           </w:p>
         </w:tc>
@@ -2153,7 +2153,7 @@
                 <w:b w:val="0"/>
                 <w:sz w:val="21"/>
               </w:rPr>
-              <w:t>s1 l.47, s2b l.49 and l.63, Table 1 and s3 l.21 all write 已获得 for signalling, mortality an…</w:t>
+              <w:t>s1第47行、s2b第49行与第63行、表1及s3第21行对以下数据均写作“已获得”：信令、死亡及…</w:t>
             </w:r>
           </w:p>
         </w:tc>
@@ -2175,7 +2175,7 @@
                 <w:b w:val="0"/>
                 <w:sz w:val="21"/>
               </w:rPr>
-              <w:t>Applicant claims vs source_dump (authors…</w:t>
+              <w:t>申请人信息与source_dump比对（作者…</w:t>
             </w:r>
           </w:p>
         </w:tc>
@@ -2215,7 +2215,7 @@
                 <w:b w:val="0"/>
                 <w:sz w:val="21"/>
               </w:rPr>
-              <w:t>Checked against the source: PhD in Design Science, ZJU, June 2025; 5 first-authored LUP/SC…</w:t>
+              <w:t>已对照原始材料核查：设计学博士（ZJU，2025年6月）；5篇第一作者LUP/SC…</w:t>
             </w:r>
           </w:p>
         </w:tc>
@@ -2237,7 +2237,7 @@
                 <w:b w:val="0"/>
                 <w:sz w:val="21"/>
               </w:rPr>
-              <w:t>Internal consistency of numbers, dates a…</w:t>
+              <w:t>内部一致性：数字、日期及…</w:t>
             </w:r>
           </w:p>
         </w:tc>
@@ -2277,7 +2277,7 @@
                 <w:b w:val="0"/>
                 <w:sz w:val="21"/>
               </w:rPr>
-              <w:t>These agree across text, Table 2 and Fig 1/2: M1 March 2028, M2 and G1 December 2028, M3 J…</w:t>
+              <w:t>以下内容在正文、表2及图1/2之间一致：M1为2028年3月，M2与G1为2028年12月，M3为…</w:t>
             </w:r>
           </w:p>
         </w:tc>
@@ -2299,7 +2299,7 @@
                 <w:b w:val="0"/>
                 <w:sz w:val="21"/>
               </w:rPr>
-              <w:t>Reference keys only from brief §8/§8b; c…</w:t>
+              <w:t>文献键仅取自写作简报§8/§8b；…</w:t>
             </w:r>
           </w:p>
         </w:tc>
@@ -2339,7 +2339,7 @@
                 <w:b w:val="0"/>
                 <w:sz w:val="21"/>
               </w:rPr>
-              <w:t>47 unique keys are used, all on the §8/§8b whitelist; none invented. The built yrd.pdf (ma…</w:t>
+              <w:t>共使用47个不重复文献键，均在§8/§8b白名单内，无杜撰。构建生成的yrd.pdf（…</w:t>
             </w:r>
           </w:p>
         </w:tc>
@@ -2361,7 +2361,7 @@
                 <w:b w:val="0"/>
                 <w:sz w:val="21"/>
               </w:rPr>
-              <w:t xml:space="preserve">New method details carry </w:t>
+              <w:t>新增方法细节标注</w:t>
             </w:r>
             <w:r>
               <w:rPr>
@@ -2410,7 +2410,7 @@
                 <w:b w:val="0"/>
                 <w:sz w:val="21"/>
               </w:rPr>
-              <w:t>Most new numbers are marked: RMSE ≤1.5 °C, 6—8 ENVI-met sites, rank correlation &lt;0.5, Shap…</w:t>
+              <w:t>多数新增数值已标注：RMSE ≤1.5 °C、6—8个ENVI-met模拟点位、秩相关&lt;0.5、Shap…</w:t>
             </w:r>
           </w:p>
         </w:tc>
@@ -2464,7 +2464,7 @@
           <w:b w:val="0"/>
           <w:sz w:val="24"/>
         </w:rPr>
-        <w:t xml:space="preserve">：Files: /tmp/claude-0/-home-user-gz/e95f3469-84dc-55c6-acde-5caa90728449/scratchpad/draft/s1.md and /tmp/claude-0/-home-user-gz/e95f3469-84dc-55c6-acde-5caa90728449/scratchpad/draft/s2a.md. Backups and private-build files are in scratchpad/rev_backup and scratc…；补充内容：- </w:t>
+        <w:t xml:space="preserve">：文件：/tmp/claude-0/-home-user-gz/e95f3469-84dc-55c6-acde-5caa90728449/scratchpad/draft/s1.md与/tmp/claude-0/-home-user-gz/e95f3469-84dc-55c6-acde-5caa90728449/scratchpad/draft/s2a.md。备份文件及私有构建文件位于scratchpad/rev_backup与scratc…；补充内容：- </w:t>
       </w:r>
       <w:r>
         <w:rPr>
@@ -2472,7 +2472,7 @@
           <w:b/>
           <w:sz w:val="24"/>
         </w:rPr>
-        <w:t>New citation:</w:t>
+        <w:t>新增引文：</w:t>
       </w:r>
       <w:r>
         <w:rPr>
@@ -2480,7 +2480,7 @@
           <w:b w:val="0"/>
           <w:sz w:val="24"/>
         </w:rPr>
-        <w:t xml:space="preserve"> ebi2021hot in s1 supports the chronic-disease and outdoor-worker risk claim, bringing the reference count to 48. - </w:t>
+        <w:t xml:space="preserve">在s1中以ebi2021hot支撑慢性病患者与户外劳动者风险的论述，参考文献增至48条。- </w:t>
       </w:r>
       <w:r>
         <w:rPr>
@@ -2488,7 +2488,7 @@
           <w:b/>
           <w:sz w:val="24"/>
         </w:rPr>
-        <w:t>Pre-registration safeguard:</w:t>
+        <w:t>预注册保障措施：</w:t>
       </w:r>
       <w:r>
         <w:rPr>
@@ -2496,7 +2496,7 @@
           <w:b w:val="0"/>
           <w:sz w:val="24"/>
         </w:rPr>
-        <w:t xml:space="preserve"> the hold-out ("封存检验期") is opened …</w:t>
+        <w:t>留出检验期（“封存检验期”）的启用…</w:t>
       </w:r>
     </w:p>
     <w:p>
@@ -2534,7 +2534,7 @@
           <w:b/>
           <w:sz w:val="24"/>
         </w:rPr>
-        <w:t>Major findings in s2b (all applied):</w:t>
+        <w:t>s2b主要问题（均已采纳）：</w:t>
       </w:r>
       <w:r>
         <w:rPr>
@@ -2550,7 +2550,7 @@
           <w:b/>
           <w:sz w:val="24"/>
         </w:rPr>
-        <w:t>3.1(1) validation:</w:t>
+        <w:t>3.1(1) 验证：</w:t>
       </w:r>
       <w:r>
         <w:rPr>
@@ -2558,7 +2558,7 @@
           <w:b w:val="0"/>
           <w:sz w:val="24"/>
         </w:rPr>
-        <w:t xml:space="preserve"> split into two sentences and wrote 均方根误差（RMSE）、平均绝对误差（MAE）. - </w:t>
+        <w:t xml:space="preserve">拆分为两句，并写作均方根误差（RMSE）、平均绝对误差（MAE）。- </w:t>
       </w:r>
       <w:r>
         <w:rPr>
@@ -2566,7 +2566,7 @@
           <w:b/>
           <w:sz w:val="24"/>
         </w:rPr>
-        <w:t>Regional automatic stations (expert):</w:t>
+        <w:t>区域自动站（专家意见）：</w:t>
       </w:r>
       <w:r>
         <w:rPr>
@@ -2574,7 +2574,7 @@
           <w:b w:val="0"/>
           <w:sz w:val="24"/>
         </w:rPr>
-        <w:t xml:space="preserve"> "区域自动站如可得，一并按空间分块参与训练与检验</w:t>
+        <w:t>“区域自动站如可得，一并按空间分块参与训练与检验</w:t>
       </w:r>
       <w:r>
         <w:rPr>
@@ -2591,7 +2591,7 @@
           <w:b w:val="0"/>
           <w:sz w:val="24"/>
         </w:rPr>
-        <w:t xml:space="preserve">". - </w:t>
+        <w:t xml:space="preserve">”。- </w:t>
       </w:r>
       <w:r>
         <w:rPr>
@@ -2599,7 +2599,7 @@
           <w:b/>
           <w:sz w:val="24"/>
         </w:rPr>
-        <w:t>Humidity (expert):</w:t>
+        <w:t>湿度（专家意见）：</w:t>
       </w:r>
       <w:r>
         <w:rPr>
@@ -2607,7 +2607,7 @@
           <w:b w:val="0"/>
           <w:sz w:val="24"/>
         </w:rPr>
-        <w:t xml:space="preserve"> "三城…湿度由站点相对湿度同法降尺度至30 m，全域以形态参数与背…；补充内容：</w:t>
+        <w:t>“三城…湿度由站点相对湿度同法降尺度至30 m，全域以形态参数与背…；补充内容：</w:t>
       </w:r>
       <w:r>
         <w:rPr>
@@ -2615,7 +2615,7 @@
           <w:b/>
           <w:sz w:val="24"/>
         </w:rPr>
-        <w:t xml:space="preserve">s2b (all new method details carry </w:t>
+        <w:t>s2b（所有新增方法细节均标注</w:t>
       </w:r>
       <w:r>
         <w:rPr>
@@ -2632,7 +2632,7 @@
           <w:b/>
           <w:sz w:val="24"/>
         </w:rPr>
-        <w:t>):</w:t>
+        <w:t>）：</w:t>
       </w:r>
       <w:r>
         <w:rPr>
@@ -2648,7 +2648,7 @@
           <w:b/>
           <w:sz w:val="24"/>
         </w:rPr>
-        <w:t>H3a modifier design (priority 1):</w:t>
+        <w:t>H3a修饰项设计（优先级1）：</w:t>
       </w:r>
       <w:r>
         <w:rPr>
@@ -2656,7 +2656,7 @@
           <w:b w:val="0"/>
           <w:sz w:val="24"/>
         </w:rPr>
-        <w:t xml:space="preserve"> "两类修饰项均于第二阶段以多元meta回归纳入，并共用U反计算的动态暴露以免NbS降温重复计入</w:t>
+        <w:t>“两类修饰项均于第二阶段以多元meta回归纳入，并共用U反计算的动态暴露以免NbS降温重复计入</w:t>
       </w:r>
       <w:r>
         <w:rPr>
@@ -2673,7 +2673,7 @@
           <w:b w:val="0"/>
           <w:sz w:val="24"/>
         </w:rPr>
-        <w:t>". This matches s2a's revised H3a, "以不含NbS局地降温的动态暴露为共同暴露". - *…</w:t>
+        <w:t>”。该表述与s2a修订后的H3a“以不含NbS局地降温的动态暴露为共同暴露”一致。- *…</w:t>
       </w:r>
     </w:p>
     <w:p>
@@ -2703,7 +2703,7 @@
           <w:b w:val="0"/>
           <w:sz w:val="24"/>
         </w:rPr>
-        <w:t>：s3 (/tmp/claude-0/-home-user-gz/e95f3469-84dc-55c6-acde-5caa90728449/scratchpad/draft/s3.md): - Major (standards, eligibility): the body no longer states that the applicant is employed by HKU-SIRI. It now reads "现任职于香港大学城市规划及设计系【待核实：与依托单位香港大学深圳研究院的聘用关系，见（四）5（1…；补充内容：- s3 proposed addition (priority 1), shortened to one sentence at the end of （2）: "申请人还协助指导香港大学与浙江大学的研究生和研究助理，并担任LUP、Cities等4种期刊的审稿人。" Source: co-supervision; reviewer for SCS, LUP, Cities and Annals …</w:t>
+        <w:t>：s3（/tmp/claude-0/-home-user-gz/e95f3469-84dc-55c6-acde-5caa90728449/scratchpad/draft/s3.md）：- 重要问题（规范、申请资格）：正文不再表述申请人受聘于HKU-SIRI，现改为“现任职于香港大学城市规划及设计系【待核实：与依托单位香港大学深圳研究院的聘用关系，见（四）5（1…；补充内容：- s3拟补充内容（优先级1），压缩为一句置于（2）末尾：“申请人还协助指导香港大学与浙江大学的研究生和研究助理，并担任LUP、Cities等4种期刊的审稿人。”依据：协助指导研究生；担任SCS、LUP、Cities及Annals …</w:t>
       </w:r>
     </w:p>
     <w:p>
@@ -2856,7 +2856,7 @@
                 <w:b w:val="0"/>
                 <w:sz w:val="21"/>
               </w:rPr>
-              <w:t>Template headings verbatim and complete …</w:t>
+              <w:t>模板标题逐字一致且完整…</w:t>
             </w:r>
           </w:p>
         </w:tc>
@@ -2896,7 +2896,7 @@
                 <w:b w:val="0"/>
                 <w:sz w:val="21"/>
               </w:rPr>
-              <w:t>I checked build/yrd.docx with python-docx against research/template.json. The title 报告正文（2…</w:t>
+              <w:t>使用python-docx对照research/template.json检查build/yrd.docx。标题报告正文（2…</w:t>
             </w:r>
           </w:p>
         </w:tc>
@@ -2918,7 +2918,7 @@
                 <w:b w:val="0"/>
                 <w:sz w:val="21"/>
               </w:rPr>
-              <w:t>Page limit ≤30 and last-page fill</w:t>
+              <w:t>页数上限≤30及末页填充</w:t>
             </w:r>
           </w:p>
         </w:tc>
@@ -2958,7 +2958,7 @@
                 <w:b w:val="0"/>
                 <w:sz w:val="21"/>
               </w:rPr>
-              <w:t>Running build_yrd.sh prints: pages=30 last_page_lines=23 per_page=[24, 23, 22, 22, 22, 22,…</w:t>
+              <w:t>运行build_yrd.sh输出：pages=30 last_page_lines=23 per_page=[24, 23, 22, 22, 22, 22,…</w:t>
             </w:r>
           </w:p>
         </w:tc>
@@ -2980,7 +2980,7 @@
                 <w:b w:val="0"/>
                 <w:sz w:val="21"/>
               </w:rPr>
-              <w:t>Mandated elements in （二）（三）（四）</w:t>
+              <w:t>（二）（三）（四）规定要素</w:t>
             </w:r>
           </w:p>
         </w:tc>
@@ -3020,7 +3020,7 @@
                 <w:b w:val="0"/>
                 <w:sz w:val="21"/>
               </w:rPr>
-              <w:t>（二） contains 科学问题与假说, 研究目标, the framework and operational definitions, the research plan w…</w:t>
+              <w:t>（二）包含科学问题与假说、研究目标、研究框架与操作性定义、研究方案及…</w:t>
             </w:r>
           </w:p>
         </w:tc>
@@ -3042,7 +3042,7 @@
                 <w:b w:val="0"/>
                 <w:sz w:val="21"/>
               </w:rPr>
-              <w:t>NSFC application rules</w:t>
+              <w:t>NSFC申请规定</w:t>
             </w:r>
           </w:p>
         </w:tc>
@@ -3082,7 +3082,7 @@
                 <w:b w:val="0"/>
                 <w:sz w:val="21"/>
               </w:rPr>
-              <w:t>The body states a 3-year period, contains no budget figures, and never mentions 博士后. It in…</w:t>
+              <w:t>正文写明研究期限为3年，未出现经费数额，也未提及博士后。其中…</w:t>
             </w:r>
           </w:p>
         </w:tc>
@@ -3104,7 +3104,7 @@
                 <w:b w:val="0"/>
                 <w:sz w:val="21"/>
               </w:rPr>
-              <w:t>References: allowed keys, GB/T 7714 cons…</w:t>
+              <w:t>参考文献：允许的文献键、GB/T 7714一致…</w:t>
             </w:r>
           </w:p>
         </w:tc>
@@ -3144,7 +3144,7 @@
                 <w:b w:val="0"/>
                 <w:sz w:val="21"/>
               </w:rPr>
-              <w:t>There are 50 references (the brief §9 cap), and every key is in brief §8/§8b; refs_yrd.jso…</w:t>
+              <w:t>参考文献共50条（写作简报§9规定的上限），所有文献键均见于写作简报§8/§8b；refs_yrd.jso…</w:t>
             </w:r>
           </w:p>
         </w:tc>
@@ -3166,7 +3166,7 @@
                 <w:b w:val="0"/>
                 <w:sz w:val="21"/>
               </w:rPr>
-              <w:t>Figures and tables</w:t>
+              <w:t>图表</w:t>
             </w:r>
           </w:p>
         </w:tc>
@@ -3206,7 +3206,7 @@
                 <w:b w:val="0"/>
                 <w:sz w:val="21"/>
               </w:rPr>
-              <w:t>图1 研究框架 and 图2 技术路线 have their captions below and are both referenced in the text. 表1 and …</w:t>
+              <w:t>图1 研究框架与图2 技术路线的图题均位于图下方，且正文中均有引用。表1与…</w:t>
             </w:r>
           </w:p>
         </w:tc>
@@ -3228,7 +3228,7 @@
                 <w:b w:val="0"/>
                 <w:sz w:val="21"/>
               </w:rPr>
-              <w:t>Abbreviations and terminology</w:t>
+              <w:t>缩写与术语</w:t>
             </w:r>
           </w:p>
         </w:tc>
@@ -3268,7 +3268,7 @@
                 <w:b w:val="0"/>
                 <w:sz w:val="21"/>
               </w:rPr>
-              <w:t>The core terms are introduced correctly as 中文（English，缩写）: NbS, LST, Ta, Tmrt, UTCI, heat …</w:t>
+              <w:t>核心术语均按“中文（English，缩写）”格式正确引入：NbS、LST、Ta、Tmrt、UTCI、热…</w:t>
             </w:r>
           </w:p>
         </w:tc>
@@ -3290,7 +3290,7 @@
                 <w:b w:val="0"/>
                 <w:sz w:val="21"/>
               </w:rPr>
-              <w:t>Facts and citation support</w:t>
+              <w:t>事实与引文支撑</w:t>
             </w:r>
           </w:p>
         </w:tc>
@@ -3330,7 +3330,7 @@
                 <w:b w:val="0"/>
                 <w:sz w:val="21"/>
               </w:rPr>
-              <w:t>I checked all 50 citations against the support notes in brief §8. Every quantitative claim…</w:t>
+              <w:t>已对照写作简报§8中的支撑说明逐条核查全部50条引文。每一项定量表述…</w:t>
             </w:r>
           </w:p>
         </w:tc>
@@ -3352,7 +3352,7 @@
                 <w:b w:val="0"/>
                 <w:sz w:val="21"/>
               </w:rPr>
-              <w:t>No invented applicant facts</w:t>
+              <w:t>无杜撰的申请人信息</w:t>
             </w:r>
           </w:p>
         </w:tc>
@@ -3392,7 +3392,7 @@
                 <w:b w:val="0"/>
                 <w:sz w:val="21"/>
               </w:rPr>
-              <w:t>I checked against src/source_dump.txt. The following are all in the source: PhD at 浙江大学 in…</w:t>
+              <w:t>已对照src/source_dump.txt核查，以下内容均见于原始材料：博士毕业于浙江大学…</w:t>
             </w:r>
           </w:p>
         </w:tc>
@@ -3414,7 +3414,7 @@
                 <w:b w:val="0"/>
                 <w:sz w:val="21"/>
               </w:rPr>
-              <w:t>Fabricated-looking specifics without 【待……</w:t>
+              <w:t>疑似杜撰的具体细节未标【待……</w:t>
             </w:r>
           </w:p>
         </w:tc>
@@ -3454,7 +3454,7 @@
                 <w:b w:val="0"/>
                 <w:sz w:val="21"/>
               </w:rPr>
-              <w:t>The rendered text contains 67 placeholders (22 待核实, 24 待确认, 21 待补充). Data years, granulari…</w:t>
+              <w:t>渲染后的文本含67处占位标记（待核实22处、待确认24处、待补充21处）。数据年份、粒…</w:t>
             </w:r>
           </w:p>
         </w:tc>
@@ -3476,7 +3476,7 @@
                 <w:b w:val="0"/>
                 <w:sz w:val="21"/>
               </w:rPr>
-              <w:t>Academic language</w:t>
+              <w:t>学术语言</w:t>
             </w:r>
           </w:p>
         </w:tc>
@@ -3516,7 +3516,7 @@
                 <w:b w:val="0"/>
                 <w:sz w:val="21"/>
               </w:rPr>
-              <w:t>The text is standard mainland academic Chinese. It contains none of the hype phrases banne…</w:t>
+              <w:t>文本为规范的大陆学术中文，未出现任何被禁…</w:t>
             </w:r>
           </w:p>
         </w:tc>
@@ -3538,7 +3538,7 @@
                 <w:b w:val="0"/>
                 <w:sz w:val="21"/>
               </w:rPr>
-              <w:t>Internal consistency of design and cross…</w:t>
+              <w:t>研究设计内部一致性及交叉…</w:t>
             </w:r>
           </w:p>
         </w:tc>
@@ -3578,7 +3578,7 @@
                 <w:b w:val="0"/>
                 <w:sz w:val="21"/>
               </w:rPr>
-              <w:t>Cross-references all resolve: （一）4, 2.2, 3.2, （三）3, （四）5, 表1 and 表2. Counts are consistent…</w:t>
+              <w:t>交叉引用均可对应：（一）4、2.2、3.2、（三）3、（四）5、表1及表2。各项计数一致…</w:t>
             </w:r>
           </w:p>
         </w:tc>
@@ -3765,7 +3765,7 @@
                 <w:b w:val="0"/>
                 <w:sz w:val="21"/>
               </w:rPr>
-              <w:t>Most core terms are used the same way throughout: DCP, DCP缺口, 实得保护, 可归因降温, 表观降温, 遮荫 (all 2…</w:t>
+              <w:t>多数核心术语全篇用法一致：DCP、DCP缺口、实得保护、可归因降温、表观降温、遮荫（均为2…</w:t>
             </w:r>
           </w:p>
         </w:tc>
@@ -3827,7 +3827,7 @@
                 <w:b w:val="0"/>
                 <w:sz w:val="21"/>
               </w:rPr>
-              <w:t>The prose is generally compact and readable. However, several sentences have a subject tha…</w:t>
+              <w:t>行文总体紧凑、可读。但若干句子的主语…</w:t>
             </w:r>
           </w:p>
         </w:tc>
@@ -3889,7 +3889,7 @@
                 <w:b w:val="0"/>
                 <w:sz w:val="21"/>
               </w:rPr>
-              <w:t>No half-width punctuation appears next to Chinese characters, no ASCII quotation marks, an…</w:t>
+              <w:t>汉字旁未出现半角标点，无ASCII引号，且…</w:t>
             </w:r>
           </w:p>
         </w:tc>
@@ -3951,7 +3951,7 @@
                 <w:b w:val="0"/>
                 <w:sz w:val="21"/>
               </w:rPr>
-              <w:t>The register is formal mainland-Chinese academic throughout. There are no slogans or boile…</w:t>
+              <w:t>全文语体为正式的大陆学术中文，无口号或套…</w:t>
             </w:r>
           </w:p>
         </w:tc>
@@ -4013,7 +4013,7 @@
                 <w:b w:val="0"/>
                 <w:sz w:val="21"/>
               </w:rPr>
-              <w:t>The overall argument flows well: background → three gaps → cascade framework → DCP → KQ/H …</w:t>
+              <w:t>整体论证流畅：研究背景 → 三项研究缺口 → 级联框架 → DCP → KQ/H …</w:t>
             </w:r>
           </w:p>
         </w:tc>
@@ -4075,7 +4075,7 @@
                 <w:b w:val="0"/>
                 <w:sz w:val="21"/>
               </w:rPr>
-              <w:t>The new 长三角 content (41城/三城 two-level design, 区县 health layer, 境内数据 handling, 长三角 facts) m…</w:t>
+              <w:t>新增的长三角内容（41城/三城两级设计、区县健康数据层、境内数据处理方式、长三角相关事实）…</w:t>
             </w:r>
           </w:p>
         </w:tc>
@@ -4114,7 +4114,7 @@
           <w:b w:val="0"/>
           <w:sz w:val="24"/>
         </w:rPr>
-        <w:t>All blocking and major defects are fixed, and every minor one is applied in full or adapted. Backups are in scratchpad/draft/r7_backup/ (all six draft files, info.md, refs_yrd.json, fig1.html and fig2.html). TERMINOLOGY (major): The two fix sets disagreed on the term, so I used 封存期 everywhere. 锁箱期 and 封存检验期 no longer appear. - s2a defines it: "健康数据最后3个暖季</w:t>
+        <w:t>全部阻断性问题与重大问题均已修正，各项次要问题均已全部采纳或经调整后采纳。备份位于scratchpad/draft/r7_backup/（含全部六个草稿文件、info.md、refs_yrd.json、fig1.html及fig2.html）。术语（重大问题）：两组修改意见对该术语的处理不一致，故全文统一使用“封存期”，“锁箱期”与“封存检验期”不再出现。- s2a的定义为：“健康数据最后3个暖季</w:t>
       </w:r>
       <w:r>
         <w:rPr>
@@ -4148,7 +4148,7 @@
           <w:b w:val="0"/>
           <w:sz w:val="24"/>
         </w:rPr>
-        <w:t>），M4前全部建模均不使用…修正须在启用封存期数据前完成；该期仅启用一次，其后修正仅作探索性分析，否定结果如实报告。" This also covers the holdout-must-be-within-2000—2024 defect. - s2b H3a criterion now reads "且封存期方向一致". - s3 risk ⑥ is rewritten to match the 1.1 holdout r…</w:t>
+        <w:t>），M4前全部建模均不使用…修正须在启用封存期数据前完成；该期仅启用一次，其后修正仅作探索性分析，否定结果如实报告。”该表述同时解决了“留出期须位于2000—2024年内”的问题。- s2b中H3a的判据现为“且封存期方向一致”。- s3风险⑥已改写，与1.1节的留出期规…</w:t>
       </w:r>
     </w:p>
     <w:p>
@@ -4163,7 +4163,7 @@
           <w:b w:val="0"/>
           <w:sz w:val="24"/>
         </w:rPr>
-        <w:t xml:space="preserve">未采纳及原因：- Cohen's κ: I did not add </w:t>
+        <w:t>未采纳及原因：- Cohen's κ：未添加</w:t>
       </w:r>
       <w:r>
         <w:rPr>
@@ -4180,7 +4180,7 @@
           <w:b w:val="0"/>
           <w:sz w:val="24"/>
         </w:rPr>
-        <w:t>. The source already specifies it ("systematic coding and Cohen's κ for consistency"), so it is not a new detail. - 五折: rather than adding '拟五折</w:t>
+        <w:t>。原稿已明确写有该方法（“系统编码并以Cohen's κ检验一致性”），不属新增细节。- 五折：未添加“拟五折</w:t>
       </w:r>
       <w:r>
         <w:rPr>
@@ -4197,7 +4197,7 @@
           <w:b w:val="0"/>
           <w:sz w:val="24"/>
         </w:rPr>
-        <w:t>', I removed the fold count entirely, so the sentence states only what the source says (spatially blocked leave-station-out cross-validation). - s2a 判据: I did not put the "（见表2）" pointer back. M4 is now dated in the text…</w:t>
+        <w:t>”，而是删去折数，使该句仅陈述原稿内容（按空间分块的留站交叉验证）。- s2a 判据：未恢复“（见表2）”的指引，M4已在正文中注明日期…</w:t>
       </w:r>
     </w:p>
     <w:p>
@@ -4365,7 +4365,7 @@
                 <w:b w:val="0"/>
                 <w:sz w:val="21"/>
               </w:rPr>
-              <w:t>Template headings verbatim and complete …</w:t>
+              <w:t>模板标题逐字一致且完整…</w:t>
             </w:r>
           </w:p>
         </w:tc>
@@ -4405,7 +4405,7 @@
                 <w:b w:val="0"/>
                 <w:sz w:val="21"/>
               </w:rPr>
-              <w:t>I removed whitespace from the pdftotext output of build/yrd.pdf and checked it against res…</w:t>
+              <w:t>将build/yrd.pdf经pdftotext提取的文本去除空白字符后，对照res…</w:t>
             </w:r>
           </w:p>
         </w:tc>
@@ -4427,7 +4427,7 @@
                 <w:b w:val="0"/>
                 <w:sz w:val="21"/>
               </w:rPr>
-              <w:t>&lt;=30 pages</w:t>
+              <w:t>&lt;=30页</w:t>
             </w:r>
           </w:p>
         </w:tc>
@@ -4467,7 +4467,7 @@
                 <w:b w:val="0"/>
                 <w:sz w:val="21"/>
               </w:rPr>
-              <w:t>pdfinfo reports 30 pages (A4). Page 30 ends about 8 lines short of full, so there is littl…</w:t>
+              <w:t>pdfinfo显示共30页（A4）。第30页距写满约差8行，可用余量很…</w:t>
             </w:r>
           </w:p>
         </w:tc>
@@ -4489,7 +4489,7 @@
                 <w:b w:val="0"/>
                 <w:sz w:val="21"/>
               </w:rPr>
-              <w:t>Mandated elements</w:t>
+              <w:t>规定要素</w:t>
             </w:r>
           </w:p>
         </w:tc>
@@ -4529,7 +4529,7 @@
                 <w:b w:val="0"/>
                 <w:sz w:val="21"/>
               </w:rPr>
-              <w:t>（二）5 特色与创新点 and （二）6 年度研究计划 (表2) are present. （三）1 has (1) 前期研究积累, (2) 已取得的研究工作成绩, (3) 可行性…</w:t>
+              <w:t>（二）5 特色与创新点与（二）6 年度研究计划（表2）均已具备。（三）1包含(1) 前期研究积累、(2) 已取得的研究工作成绩、(3) 可行性…</w:t>
             </w:r>
           </w:p>
         </w:tc>
@@ -4551,7 +4551,7 @@
                 <w:b w:val="0"/>
                 <w:sz w:val="21"/>
               </w:rPr>
-              <w:t>NSFC application rules (AI disclosure in…</w:t>
+              <w:t>NSFC申请规定（AI使用声明…</w:t>
             </w:r>
           </w:p>
         </w:tc>
@@ -4591,7 +4591,7 @@
                 <w:b w:val="0"/>
                 <w:sz w:val="21"/>
               </w:rPr>
-              <w:t>The AI statement in （四）5（3） is detailed and honest about ChatGPT and Claude. However, the …</w:t>
+              <w:t>（四）5（3）中的AI使用说明对ChatGPT与Claude的使用描述详细、如实。但…</w:t>
             </w:r>
           </w:p>
         </w:tc>
@@ -4613,7 +4613,7 @@
                 <w:b w:val="0"/>
                 <w:sz w:val="21"/>
               </w:rPr>
-              <w:t>Every number/fact supported by brief §7 …</w:t>
+              <w:t>每项数字／事实均有写作简报§7支撑…</w:t>
             </w:r>
           </w:p>
         </w:tc>
@@ -4653,7 +4653,7 @@
                 <w:b w:val="0"/>
                 <w:sz w:val="21"/>
               </w:rPr>
-              <w:t>Checked every figure in s1: 0.31 °C/10a, 华东2025, 1.7–2.8 °C, 79 days, 热岛20年, 62,961/35,987…</w:t>
+              <w:t>已核查s1中全部数字：0.31 °C/10a、华东2025、1.7–2.8 °C、79天、热岛20年、62,961/35,987…</w:t>
             </w:r>
           </w:p>
         </w:tc>
@@ -4675,7 +4675,7 @@
                 <w:b w:val="0"/>
                 <w:sz w:val="21"/>
               </w:rPr>
-              <w:t xml:space="preserve">Every </w:t>
+              <w:t>每个</w:t>
             </w:r>
             <w:r>
               <w:rPr>
@@ -4683,7 +4683,7 @@
                 <w:b w:val="0"/>
                 <w:sz w:val="21"/>
               </w:rPr>
-              <w:t xml:space="preserve"> supports its sentence</w:t>
+              <w:t>均支撑所在句</w:t>
             </w:r>
           </w:p>
         </w:tc>
@@ -4723,7 +4723,7 @@
                 <w:b w:val="0"/>
                 <w:sz w:val="21"/>
               </w:rPr>
-              <w:t>There are 50 unique keys, all in brief §8/§8b, and no key outside the bank. Each was check…</w:t>
+              <w:t>共50个不重复文献键，均见于写作简报§8/§8b，无文献库以外的键。每个键均经…</w:t>
             </w:r>
           </w:p>
         </w:tc>
@@ -4745,7 +4745,7 @@
                 <w:b w:val="0"/>
                 <w:sz w:val="21"/>
               </w:rPr>
-              <w:t>No invented applicant facts</w:t>
+              <w:t>无杜撰的申请人信息</w:t>
             </w:r>
           </w:p>
         </w:tc>
@@ -4785,7 +4785,7 @@
                 <w:b w:val="0"/>
                 <w:sz w:val="21"/>
               </w:rPr>
-              <w:t>Checked against src/source_dump.txt: PhD (ZJU, June 2025); 450 citations, h=9, i10=9 as of…</w:t>
+              <w:t>已对照src/source_dump.txt核查：博士学位（ZJU，2025年6月）；被引450次，h=9，i10=9，截至…</w:t>
             </w:r>
           </w:p>
         </w:tc>
@@ -4807,7 +4807,7 @@
                 <w:b w:val="0"/>
                 <w:sz w:val="21"/>
               </w:rPr>
-              <w:t xml:space="preserve">New method specifics marked </w:t>
+              <w:t>新增方法细节标注</w:t>
             </w:r>
             <w:r>
               <w:rPr>
@@ -4856,7 +4856,7 @@
                 <w:b w:val="0"/>
                 <w:sz w:val="21"/>
               </w:rPr>
-              <w:t>Most new specifics are marked: the DCP definition, RMSE ≤1.5 °C, warm season 5–10月, 6–8 EN…</w:t>
+              <w:t>多数新增细节已标注：DCP定义、RMSE ≤1.5 °C、暖季5–10月、6–8个EN…</w:t>
             </w:r>
           </w:p>
         </w:tc>
@@ -4878,7 +4878,7 @@
                 <w:b w:val="0"/>
                 <w:sz w:val="21"/>
               </w:rPr>
-              <w:t>Cross-section consistency of core terms …</w:t>
+              <w:t>核心术语跨章节一致性…</w:t>
             </w:r>
           </w:p>
         </w:tc>
@@ -4918,7 +4918,7 @@
                 <w:b w:val="0"/>
                 <w:sz w:val="21"/>
               </w:rPr>
-              <w:t>These are consistent across s1, s2a, s2b, s2c, s3, s4, info and both figures: 封存期 (s2a/s2b…</w:t>
+              <w:t>以下术语在s1、s2a、s2b、s2c、s3、s4、info及两幅图中一致：封存期（s2a/s2b…</w:t>
             </w:r>
           </w:p>
         </w:tc>
@@ -4940,7 +4940,7 @@
                 <w:b w:val="0"/>
                 <w:sz w:val="21"/>
               </w:rPr>
-              <w:t>References GB/T 7714 consistency</w:t>
+              <w:t>参考文献GB/T 7714格式一致性</w:t>
             </w:r>
           </w:p>
         </w:tc>
@@ -4980,7 +4980,7 @@
                 <w:b w:val="0"/>
                 <w:sz w:val="21"/>
               </w:rPr>
-              <w:t>There are 50 entries, numbered in order. Format is consistent: [J]/[M]//[R]/[EB/OL]/[R/OL]…</w:t>
+              <w:t>共50条，按顺序编号。格式一致：[J]/[M]//[R]/[EB/OL]/[R/OL]…</w:t>
             </w:r>
           </w:p>
         </w:tc>
@@ -5167,7 +5167,7 @@
                 <w:b w:val="0"/>
                 <w:sz w:val="21"/>
               </w:rPr>
-              <w:t>Core terms are used consistently across s1–s4: DCP, DCP缺口, NbS可归因降温, 资源供给—实得保护—保护缺口, 封存期, …</w:t>
+              <w:t>核心术语在s1–s4中用法一致：DCP、DCP缺口、NbS可归因降温、资源供给—实得保护—保护缺口、封存期、…</w:t>
             </w:r>
           </w:p>
         </w:tc>
@@ -5229,7 +5229,7 @@
                 <w:b w:val="0"/>
                 <w:sz w:val="21"/>
               </w:rPr>
-              <w:t>Most sentences are compact and parse correctly. Remaining problems: H2b has two colons in …</w:t>
+              <w:t>多数句子紧凑、结构正确。残留问题：H2b出现两个冒号，位于…</w:t>
             </w:r>
           </w:p>
         </w:tc>
@@ -5291,7 +5291,7 @@
                 <w:b w:val="0"/>
                 <w:sz w:val="21"/>
               </w:rPr>
-              <w:t>Checked by script: all punctuation is full-width. Quotes, brackets and bold markers are ba…</w:t>
+              <w:t>经脚本检查：标点均为全角。引号、括号与加粗标记均成…</w:t>
             </w:r>
           </w:p>
         </w:tc>
@@ -5353,7 +5353,7 @@
                 <w:b w:val="0"/>
                 <w:sz w:val="21"/>
               </w:rPr>
-              <w:t>No slogans (填补空白, 国际领先, 突破, 赋能 and similar: zero hits). Colloquial or loose spots remain: …</w:t>
+              <w:t>无口号（填补空白、国际领先、突破、赋能等均零命中）。仍有口语化或表述松散之处：…</w:t>
             </w:r>
           </w:p>
         </w:tc>
@@ -5415,7 +5415,7 @@
                 <w:b w:val="0"/>
                 <w:sz w:val="21"/>
               </w:rPr>
-              <w:t>The argument chain is clear: background → 2.1–2.3 gaps → summary → cascade framework → sig…</w:t>
+              <w:t>论证链条清晰：研究背景 → 2.1–2.3研究缺口 → 小结 → 级联框架 → …</w:t>
             </w:r>
           </w:p>
         </w:tc>
@@ -5477,7 +5477,7 @@
                 <w:b w:val="0"/>
                 <w:sz w:val="21"/>
               </w:rPr>
-              <w:t>Script listing of every Latin token at first occurrence shows that LST, Ta, Tmrt, UTCI, LC…</w:t>
+              <w:t>经脚本列出每个拉丁字符词的首次出现，LST、Ta、Tmrt、UTCI、LC…</w:t>
             </w:r>
           </w:p>
         </w:tc>

</xml_diff>